<commit_message>
update: sync Consultant IA date (March 2026), Master start date (Dec 2025), and upgrade Cover Letter layout & academic internship mention
</commit_message>
<xml_diff>
--- a/KOA_MARIE_GERVAIS_NELLY_COVER_LETTER_UNDP.docx
+++ b/KOA_MARIE_GERVAIS_NELLY_COVER_LETTER_UNDP.docx
@@ -13,7 +13,7 @@
           <w:rFonts w:ascii="Segoe UI" w:hAnsi="Segoe UI"/>
           <w:b/>
           <w:color w:val="0A1128"/>
-          <w:sz w:val="34"/>
+          <w:sz w:val="38"/>
         </w:rPr>
         <w:t>KOA MARIE GERVAIS NELLY</w:t>
       </w:r>
@@ -27,7 +27,7 @@
           <w:rFonts w:ascii="Segoe UI" w:hAnsi="Segoe UI"/>
           <w:b/>
           <w:color w:val="0284C7"/>
-          <w:sz w:val="18"/>
+          <w:sz w:val="20"/>
         </w:rPr>
         <w:t>Lead AI Engineer &amp; Data Architect   │   M.Sc. Candidate in Applied AI</w:t>
       </w:r>
@@ -39,22 +39,365 @@
       <w:r>
         <w:rPr>
           <w:rFonts w:ascii="Segoe UI" w:hAnsi="Segoe UI"/>
-          <w:color w:val="526D82"/>
-          <w:sz w:val="16"/>
+          <w:color w:val="475569"/>
+          <w:sz w:val="17"/>
         </w:rPr>
         <w:t>Douala / Ngaoundéré, Cameroon   •   magenel85@gmail.com   •   +237 695 35 34 02   •   linkedin.com/in/marie-gervais-koa</w:t>
       </w:r>
     </w:p>
     <w:p>
       <w:pPr>
-        <w:spacing w:after="140"/>
+        <w:spacing w:after="120"/>
       </w:pPr>
       <w:r>
         <w:rPr>
           <w:color w:val="0284C7"/>
           <w:sz w:val="9"/>
         </w:rPr>
-        <w:t>━━━━━━━━━━━━━━━━━━━━━━━━━━━━━━━━━━━━━━━━━━━━━━━━━━━━━━━━━━━━━━━━━</w:t>
+        <w:t>━━━━━━━━━━━━━━━━━━━━━━━━━</w:t>
+      </w:r>
+      <w:r>
+        <w:rPr>
+          <w:color w:val="0284C7"/>
+          <w:sz w:val="9"/>
+        </w:rPr>
+        <w:t>─────────────────────────────────────────────</w:t>
+      </w:r>
+    </w:p>
+    <w:p>
+      <w:pPr>
+        <w:spacing w:after="70"/>
+      </w:pPr>
+      <w:r>
+        <w:rPr>
+          <w:rFonts w:ascii="Segoe UI" w:hAnsi="Segoe UI"/>
+          <w:b/>
+          <w:color w:val="0A1128"/>
+          <w:sz w:val="18"/>
+        </w:rPr>
+        <w:t>September 4, 2026</w:t>
+      </w:r>
+    </w:p>
+    <w:p>
+      <w:pPr>
+        <w:spacing w:after="90" w:line="274" w:lineRule="auto"/>
+      </w:pPr>
+      <w:r>
+        <w:rPr>
+          <w:rFonts w:ascii="Segoe UI" w:hAnsi="Segoe UI"/>
+          <w:b/>
+          <w:color w:val="0A1128"/>
+          <w:sz w:val="18"/>
+        </w:rPr>
+        <w:t>To: Selection Committee</w:t>
+      </w:r>
+      <w:r>
+        <w:rPr>
+          <w:rFonts w:ascii="Segoe UI" w:hAnsi="Segoe UI"/>
+          <w:b/>
+          <w:color w:val="0A1128"/>
+          <w:sz w:val="18"/>
+        </w:rPr>
+        <w:br/>
+      </w:r>
+      <w:r>
+        <w:rPr>
+          <w:rFonts w:ascii="Segoe UI" w:hAnsi="Segoe UI"/>
+          <w:color w:val="0A1128"/>
+          <w:sz w:val="18"/>
+        </w:rPr>
+        <w:t>Digital, AI and Innovation (DAI) Hub  │  Bureau for Policy and Programme Support (BPPS)</w:t>
+      </w:r>
+      <w:r>
+        <w:rPr>
+          <w:rFonts w:ascii="Segoe UI" w:hAnsi="Segoe UI"/>
+          <w:color w:val="0A1128"/>
+          <w:sz w:val="18"/>
+        </w:rPr>
+        <w:br/>
+        <w:t>United Nations Development Programme (UNDP)</w:t>
+      </w:r>
+      <w:r>
+        <w:rPr>
+          <w:rFonts w:ascii="Segoe UI" w:hAnsi="Segoe UI"/>
+          <w:color w:val="0A1128"/>
+          <w:sz w:val="18"/>
+        </w:rPr>
+        <w:br/>
+      </w:r>
+      <w:r>
+        <w:rPr>
+          <w:rFonts w:ascii="Segoe UI" w:hAnsi="Segoe UI"/>
+          <w:i/>
+          <w:color w:val="0A1128"/>
+          <w:sz w:val="18"/>
+        </w:rPr>
+        <w:t>Job Identification: 33001 — Digital,</w:t>
+      </w:r>
+      <w:r>
+        <w:rPr>
+          <w:rFonts w:ascii="Segoe UI" w:hAnsi="Segoe UI"/>
+          <w:i/>
+          <w:color w:val="0A1128"/>
+          <w:sz w:val="18"/>
+        </w:rPr>
+        <w:t xml:space="preserve"> AI and Innovation Internship: Global Call for 2026</w:t>
+      </w:r>
+    </w:p>
+    <w:p>
+      <w:pPr>
+        <w:spacing w:before="40" w:after="90"/>
+      </w:pPr>
+      <w:r>
+        <w:rPr>
+          <w:rFonts w:ascii="Segoe UI" w:hAnsi="Segoe UI"/>
+          <w:b/>
+          <w:color w:val="0284C7"/>
+          <w:sz w:val="19"/>
+        </w:rPr>
+        <w:t>SUBJECT: Application for Digital, AI and Innovation Internship (Home-Based) — Job ID: 33001</w:t>
+      </w:r>
+    </w:p>
+    <w:p>
+      <w:pPr>
+        <w:spacing w:after="70"/>
+      </w:pPr>
+      <w:r>
+        <w:rPr>
+          <w:rFonts w:ascii="Segoe UI" w:hAnsi="Segoe UI"/>
+          <w:color w:val="0A1128"/>
+          <w:sz w:val="18"/>
+        </w:rPr>
+        <w:t>Dear Members of the Selection Committee,</w:t>
+      </w:r>
+    </w:p>
+    <w:p>
+      <w:pPr>
+        <w:spacing w:after="90"/>
+      </w:pPr>
+      <w:r>
+        <w:rPr>
+          <w:rFonts w:ascii="Segoe UI" w:hAnsi="Segoe UI"/>
+          <w:color w:val="1E293B"/>
+          <w:sz w:val="18"/>
+        </w:rPr>
+        <w:t xml:space="preserve">I am writing to submit my enthusiastic application for the Digital, AI </w:t>
+      </w:r>
+      <w:r>
+        <w:rPr>
+          <w:rFonts w:ascii="Segoe UI" w:hAnsi="Segoe UI"/>
+          <w:color w:val="1E293B"/>
+          <w:sz w:val="18"/>
+        </w:rPr>
+        <w:t>and Innovation Internship (Job ID: 33001) within UNDP's Bureau for Policy and Programme Support (BPPS). Currently enrolled in a Master's Degree in Applied Artificial Intelligence at the University of Ngaoundéré (Dec. 2025 – 2027) with a prior Civil Enginee</w:t>
+      </w:r>
+      <w:r>
+        <w:rPr>
+          <w:rFonts w:ascii="Segoe UI" w:hAnsi="Segoe UI"/>
+          <w:color w:val="1E293B"/>
+          <w:sz w:val="18"/>
+        </w:rPr>
+        <w:t>ring degree (B.Sc.), this 3-month home-based internship directly fulfills my postgraduate degree's mandatory internship curriculum requirement. It also represents a premier opportunity to place my expertise in sovereign AI systems, data engineering, and di</w:t>
+      </w:r>
+      <w:r>
+        <w:rPr>
+          <w:rFonts w:ascii="Segoe UI" w:hAnsi="Segoe UI"/>
+          <w:color w:val="1E293B"/>
+          <w:sz w:val="18"/>
+        </w:rPr>
+        <w:t>gital public goods at the service of UNDP's mission to accelerate the Sustainable Development Goals (SDGs).</w:t>
+      </w:r>
+    </w:p>
+    <w:p>
+      <w:pPr>
+        <w:spacing w:after="64" w:line="271" w:lineRule="auto"/>
+        <w:ind w:left="216"/>
+      </w:pPr>
+      <w:r>
+        <w:rPr>
+          <w:rFonts w:ascii="Segoe UI" w:hAnsi="Segoe UI"/>
+          <w:b/>
+          <w:color w:val="0284C7"/>
+          <w:sz w:val="18"/>
+        </w:rPr>
+        <w:t>▪</w:t>
+      </w:r>
+      <w:r>
+        <w:rPr>
+          <w:rFonts w:ascii="Segoe UI" w:hAnsi="Segoe UI"/>
+          <w:b/>
+          <w:color w:val="0284C7"/>
+          <w:sz w:val="18"/>
+        </w:rPr>
+        <w:t xml:space="preserve">  </w:t>
+      </w:r>
+      <w:r>
+        <w:rPr>
+          <w:rFonts w:ascii="Segoe UI" w:hAnsi="Segoe UI"/>
+          <w:b/>
+          <w:color w:val="0A1128"/>
+          <w:sz w:val="18"/>
+        </w:rPr>
+        <w:t xml:space="preserve">AI Product Build &amp; Systems Innovation: </w:t>
+      </w:r>
+      <w:r>
+        <w:rPr>
+          <w:rFonts w:ascii="Segoe UI" w:hAnsi="Segoe UI"/>
+          <w:color w:val="1E293B"/>
+          <w:sz w:val="18"/>
+        </w:rPr>
+        <w:t>As founder of Archi Cam AI (official applicant to the Google Africa Applied AI Lab 2026), I built an agent</w:t>
+      </w:r>
+      <w:r>
+        <w:rPr>
+          <w:rFonts w:ascii="Segoe UI" w:hAnsi="Segoe UI"/>
+          <w:color w:val="1E293B"/>
+          <w:sz w:val="18"/>
+        </w:rPr>
+        <w:t>ic platform combining Gemma and Gemini LLMs with 5D BIM standards to automate construction estimation and planning in &lt;45s (R²=0.9872). Furthermore, as an applied Master 1 research project, I engineered K1-MATHINFO v3, a sovereign multi-agent GraphRAG arch</w:t>
+      </w:r>
+      <w:r>
+        <w:rPr>
+          <w:rFonts w:ascii="Segoe UI" w:hAnsi="Segoe UI"/>
+          <w:color w:val="1E293B"/>
+          <w:sz w:val="18"/>
+        </w:rPr>
+        <w:t>itecture indexing 470 academic theses with Neo4j and LangGraph, incorporating Open Knowledge Framework (OKF) zero-hallucination verification.</w:t>
+      </w:r>
+    </w:p>
+    <w:p>
+      <w:pPr>
+        <w:spacing w:after="64" w:line="271" w:lineRule="auto"/>
+        <w:ind w:left="216"/>
+      </w:pPr>
+      <w:r>
+        <w:rPr>
+          <w:rFonts w:ascii="Segoe UI" w:hAnsi="Segoe UI"/>
+          <w:b/>
+          <w:color w:val="0284C7"/>
+          <w:sz w:val="18"/>
+        </w:rPr>
+        <w:t>▪</w:t>
+      </w:r>
+      <w:r>
+        <w:rPr>
+          <w:rFonts w:ascii="Segoe UI" w:hAnsi="Segoe UI"/>
+          <w:b/>
+          <w:color w:val="0284C7"/>
+          <w:sz w:val="18"/>
+        </w:rPr>
+        <w:t xml:space="preserve">  </w:t>
+      </w:r>
+      <w:r>
+        <w:rPr>
+          <w:rFonts w:ascii="Segoe UI" w:hAnsi="Segoe UI"/>
+          <w:b/>
+          <w:color w:val="0A1128"/>
+          <w:sz w:val="18"/>
+        </w:rPr>
+        <w:t xml:space="preserve">Data-Driven Impact for Climate &amp; Vulnerable Communities: </w:t>
+      </w:r>
+      <w:r>
+        <w:rPr>
+          <w:rFonts w:ascii="Segoe UI" w:hAnsi="Segoe UI"/>
+          <w:color w:val="1E293B"/>
+          <w:sz w:val="18"/>
+        </w:rPr>
+        <w:t>Dedicated to the 'Leave No One Behind' principle, I co</w:t>
+      </w:r>
+      <w:r>
+        <w:rPr>
+          <w:rFonts w:ascii="Segoe UI" w:hAnsi="Segoe UI"/>
+          <w:color w:val="1E293B"/>
+          <w:sz w:val="18"/>
+        </w:rPr>
+        <w:t>-developed VigieSahel, an agro-climatic forecasting system combining XGBoost predictive models and Supabase to reduce crop seeding losses by 35% and anticipate epidemic risks by 14 days in the Sahel region. Additionally, through Dataset Automator (Google C</w:t>
+      </w:r>
+      <w:r>
+        <w:rPr>
+          <w:rFonts w:ascii="Segoe UI" w:hAnsi="Segoe UI"/>
+          <w:color w:val="1E293B"/>
+          <w:sz w:val="18"/>
+        </w:rPr>
+        <w:t>loud Hackathon), I implemented MLOps pipelines with KS/PSI data drift tracking and EU AI Act alignment frameworks.</w:t>
+      </w:r>
+    </w:p>
+    <w:p>
+      <w:pPr>
+        <w:spacing w:after="64" w:line="271" w:lineRule="auto"/>
+        <w:ind w:left="216"/>
+      </w:pPr>
+      <w:r>
+        <w:rPr>
+          <w:rFonts w:ascii="Segoe UI" w:hAnsi="Segoe UI"/>
+          <w:b/>
+          <w:color w:val="0284C7"/>
+          <w:sz w:val="18"/>
+        </w:rPr>
+        <w:t>▪</w:t>
+      </w:r>
+      <w:r>
+        <w:rPr>
+          <w:rFonts w:ascii="Segoe UI" w:hAnsi="Segoe UI"/>
+          <w:b/>
+          <w:color w:val="0284C7"/>
+          <w:sz w:val="18"/>
+        </w:rPr>
+        <w:t xml:space="preserve">  </w:t>
+      </w:r>
+      <w:r>
+        <w:rPr>
+          <w:rFonts w:ascii="Segoe UI" w:hAnsi="Segoe UI"/>
+          <w:b/>
+          <w:color w:val="0A1128"/>
+          <w:sz w:val="18"/>
+        </w:rPr>
+        <w:t xml:space="preserve">Institutional Rigor, Ethics &amp; Public Service Integrity: </w:t>
+      </w:r>
+      <w:r>
+        <w:rPr>
+          <w:rFonts w:ascii="Segoe UI" w:hAnsi="Segoe UI"/>
+          <w:color w:val="1E293B"/>
+          <w:sz w:val="18"/>
+        </w:rPr>
+        <w:t>In addition to my AI capabilities, my service as an Aviation Security Officer (AVS</w:t>
+      </w:r>
+      <w:r>
+        <w:rPr>
+          <w:rFonts w:ascii="Segoe UI" w:hAnsi="Segoe UI"/>
+          <w:color w:val="1E293B"/>
+          <w:sz w:val="18"/>
+        </w:rPr>
+        <w:t xml:space="preserve">EC) at the Cameroon Civil Aviation Authority (CCAA) has instilled uncompromising discipline and crisis management readiness. In recognition of this dedication, I was awarded the official Certificate of Excellence for Performance and Integrity (April 2023) </w:t>
+      </w:r>
+      <w:r>
+        <w:rPr>
+          <w:rFonts w:ascii="Segoe UI" w:hAnsi="Segoe UI"/>
+          <w:color w:val="1E293B"/>
+          <w:sz w:val="18"/>
+        </w:rPr>
+        <w:t>by the Director General of CCAA. I bring this proven public-service integrity to AI governance, emphasizing explainability (SHAP Sentinel Audit), fairness, and responsible data policy.</w:t>
+      </w:r>
+    </w:p>
+    <w:p>
+      <w:pPr>
+        <w:spacing w:after="90"/>
+      </w:pPr>
+      <w:r>
+        <w:rPr>
+          <w:rFonts w:ascii="Segoe UI" w:hAnsi="Segoe UI"/>
+          <w:color w:val="1E293B"/>
+          <w:sz w:val="18"/>
+        </w:rPr>
+        <w:t>Joining the UNDP DAI Hub is an exceptional opportunity to translate cut</w:t>
+      </w:r>
+      <w:r>
+        <w:rPr>
+          <w:rFonts w:ascii="Segoe UI" w:hAnsi="Segoe UI"/>
+          <w:color w:val="1E293B"/>
+          <w:sz w:val="18"/>
+        </w:rPr>
+        <w:t>ting-edge AI research into scalable, inclusive development solutions for Country Offices. Available immediately for a 3-month remote arrangement, I am eager to contribute with technical rigor, intercultural agility, and high dedication.</w:t>
       </w:r>
     </w:p>
     <w:p>
@@ -64,330 +407,18 @@
       <w:r>
         <w:rPr>
           <w:rFonts w:ascii="Segoe UI" w:hAnsi="Segoe UI"/>
-          <w:b/>
-          <w:color w:val="0A1128"/>
-          <w:sz w:val="17"/>
+          <w:color w:val="1E293B"/>
+          <w:sz w:val="18"/>
         </w:rPr>
-        <w:t>September 4, 2026</w:t>
-      </w:r>
-    </w:p>
-    <w:p>
-      <w:pPr>
-        <w:spacing w:after="100" w:line="269" w:lineRule="auto"/>
-      </w:pPr>
-      <w:r>
-        <w:rPr>
-          <w:rFonts w:ascii="Segoe UI" w:hAnsi="Segoe UI"/>
-          <w:b/>
-          <w:color w:val="0A1128"/>
-          <w:sz w:val="17"/>
-        </w:rPr>
-        <w:t>To: Selection Committee</w:t>
+        <w:t>Thank you very much</w:t>
       </w:r>
       <w:r>
         <w:rPr>
           <w:rFonts w:ascii="Segoe UI" w:hAnsi="Segoe UI"/>
-          <w:b/>
-          <w:color w:val="0A1128"/>
-          <w:sz w:val="17"/>
-        </w:rPr>
-        <w:br/>
-      </w:r>
-      <w:r>
-        <w:rPr>
-          <w:rFonts w:ascii="Segoe UI" w:hAnsi="Segoe UI"/>
-          <w:color w:val="0A1128"/>
-          <w:sz w:val="17"/>
-        </w:rPr>
-        <w:t>Digital, AI and Innovation (DAI) Hub  │  Bureau for Policy and Programme Support (BPPS)</w:t>
-      </w:r>
-      <w:r>
-        <w:rPr>
-          <w:rFonts w:ascii="Segoe UI" w:hAnsi="Segoe UI"/>
-          <w:color w:val="0A1128"/>
-          <w:sz w:val="17"/>
-        </w:rPr>
-        <w:br/>
-        <w:t>United Nations Development Programme (UNDP)</w:t>
-      </w:r>
-      <w:r>
-        <w:rPr>
-          <w:rFonts w:ascii="Segoe UI" w:hAnsi="Segoe UI"/>
-          <w:color w:val="0A1128"/>
-          <w:sz w:val="17"/>
-        </w:rPr>
-        <w:br/>
-      </w:r>
-      <w:r>
-        <w:rPr>
-          <w:rFonts w:ascii="Segoe UI" w:hAnsi="Segoe UI"/>
-          <w:i/>
-          <w:color w:val="0A1128"/>
-          <w:sz w:val="17"/>
-        </w:rPr>
-        <w:t>Job Identificati</w:t>
-      </w:r>
-      <w:r>
-        <w:rPr>
-          <w:rFonts w:ascii="Segoe UI" w:hAnsi="Segoe UI"/>
-          <w:i/>
-          <w:color w:val="0A1128"/>
-          <w:sz w:val="17"/>
-        </w:rPr>
-        <w:t>on: 33001 — Digital, AI and Innovation Internship: Global Call for 2026</w:t>
-      </w:r>
-    </w:p>
-    <w:p>
-      <w:pPr>
-        <w:spacing w:before="40" w:after="100"/>
-      </w:pPr>
-      <w:r>
-        <w:rPr>
-          <w:rFonts w:ascii="Segoe UI" w:hAnsi="Segoe UI"/>
-          <w:b/>
-          <w:color w:val="0284C7"/>
+          <w:color w:val="1E293B"/>
           <w:sz w:val="18"/>
         </w:rPr>
-        <w:t>SUBJECT: Application for Digital, AI and Innovation Internship (Home-Based)</w:t>
-      </w:r>
-    </w:p>
-    <w:p>
-      <w:pPr>
-        <w:spacing w:after="60"/>
-      </w:pPr>
-      <w:r>
-        <w:rPr>
-          <w:rFonts w:ascii="Segoe UI" w:hAnsi="Segoe UI"/>
-          <w:color w:val="0A1128"/>
-          <w:sz w:val="17"/>
-        </w:rPr>
-        <w:t>Dear Members of the Selection Committee,</w:t>
-      </w:r>
-    </w:p>
-    <w:p>
-      <w:pPr>
-        <w:spacing w:after="70" w:line="269" w:lineRule="auto"/>
-      </w:pPr>
-      <w:r>
-        <w:rPr>
-          <w:rFonts w:ascii="Segoe UI" w:hAnsi="Segoe UI"/>
-          <w:color w:val="27374D"/>
-          <w:sz w:val="17"/>
-        </w:rPr>
-        <w:t>I am writing to express my enthusiastic application for the Digital</w:t>
-      </w:r>
-      <w:r>
-        <w:rPr>
-          <w:rFonts w:ascii="Segoe UI" w:hAnsi="Segoe UI"/>
-          <w:color w:val="27374D"/>
-          <w:sz w:val="17"/>
-        </w:rPr>
-        <w:t>, AI and Innovation Internship within UNDP's Bureau for Policy and Programme Support (BPPS). Currently enrolled in a Master's degree in Applied Artificial Intelligence at the University of Ngaoundéré (Cameroon) following a Civil Engineering degree (B.Sc.),</w:t>
-      </w:r>
-      <w:r>
-        <w:rPr>
-          <w:rFonts w:ascii="Segoe UI" w:hAnsi="Segoe UI"/>
-          <w:color w:val="27374D"/>
-          <w:sz w:val="17"/>
-        </w:rPr>
-        <w:t xml:space="preserve"> I design sovereign, ethical, and high-impact AI systems. I am eager to contribute my technical acumen, product development experience, and commitment to digital public goods to UNDP's mission of accelerating the Sustainable Development Goals (SDGs).</w:t>
-      </w:r>
-    </w:p>
-    <w:p>
-      <w:pPr>
-        <w:spacing w:after="50" w:line="264" w:lineRule="auto"/>
-        <w:ind w:left="216"/>
-      </w:pPr>
-      <w:r>
-        <w:rPr>
-          <w:b/>
-          <w:color w:val="0284C7"/>
-          <w:sz w:val="17"/>
-        </w:rPr>
-        <w:t>▪</w:t>
-      </w:r>
-      <w:r>
-        <w:rPr>
-          <w:b/>
-          <w:color w:val="0284C7"/>
-          <w:sz w:val="17"/>
-        </w:rPr>
-        <w:t xml:space="preserve">  </w:t>
-      </w:r>
-      <w:r>
-        <w:rPr>
-          <w:b/>
-          <w:color w:val="0A1128"/>
-          <w:sz w:val="17"/>
-        </w:rPr>
-        <w:t>AI</w:t>
-      </w:r>
-      <w:r>
-        <w:rPr>
-          <w:b/>
-          <w:color w:val="0A1128"/>
-          <w:sz w:val="17"/>
-        </w:rPr>
-        <w:t xml:space="preserve"> Product Build &amp; Systems Innovation: </w:t>
-      </w:r>
-      <w:r>
-        <w:rPr>
-          <w:color w:val="27374D"/>
-          <w:sz w:val="17"/>
-        </w:rPr>
-        <w:t>As founder of Archi Cam AI (official applicant to the Google Africa Applied AI Lab 2026), I developed an agentic platform combining Gemma and Gemini LLMs with 5D BIM standards to automate construction cost estimation an</w:t>
-      </w:r>
-      <w:r>
-        <w:rPr>
-          <w:color w:val="27374D"/>
-          <w:sz w:val="17"/>
-        </w:rPr>
-        <w:t>d planning (&lt;45s, R²=0.9872). Furthermore, I engineered K1-MATHINFO v3, a sovereign multi-agent GraphRAG architecture indexing 470 academic theses with Neo4j and LangGraph, incorporating OKF zero-hallucination verification protocols.</w:t>
-      </w:r>
-    </w:p>
-    <w:p>
-      <w:pPr>
-        <w:spacing w:after="50" w:line="264" w:lineRule="auto"/>
-        <w:ind w:left="216"/>
-      </w:pPr>
-      <w:r>
-        <w:rPr>
-          <w:b/>
-          <w:color w:val="0284C7"/>
-          <w:sz w:val="17"/>
-        </w:rPr>
-        <w:t>▪</w:t>
-      </w:r>
-      <w:r>
-        <w:rPr>
-          <w:b/>
-          <w:color w:val="0284C7"/>
-          <w:sz w:val="17"/>
-        </w:rPr>
-        <w:t xml:space="preserve">  </w:t>
-      </w:r>
-      <w:r>
-        <w:rPr>
-          <w:b/>
-          <w:color w:val="0A1128"/>
-          <w:sz w:val="17"/>
-        </w:rPr>
-        <w:t xml:space="preserve">Data-Driven Impact </w:t>
-      </w:r>
-      <w:r>
-        <w:rPr>
-          <w:b/>
-          <w:color w:val="0A1128"/>
-          <w:sz w:val="17"/>
-        </w:rPr>
-        <w:t xml:space="preserve">for Climate &amp; Vulnerable Regions: </w:t>
-      </w:r>
-      <w:r>
-        <w:rPr>
-          <w:color w:val="27374D"/>
-          <w:sz w:val="17"/>
-        </w:rPr>
-        <w:t>Driven by the 'Leave No One Behind' principle, I co-developed VigieSahel, an agro-climatic forecasting system combining XGBoost predictive models and Supabase to reduce crop seeding losses by 35% and anticipate epidemic ri</w:t>
-      </w:r>
-      <w:r>
-        <w:rPr>
-          <w:color w:val="27374D"/>
-          <w:sz w:val="17"/>
-        </w:rPr>
-        <w:t>sks by 14 days in the Sahel region. Additionally, through Dataset Automator (Google Cloud Hackathon), I built MLOps pipelines implementing KS/PSI data drift monitoring and EU AI Act alignment frameworks.</w:t>
-      </w:r>
-    </w:p>
-    <w:p>
-      <w:pPr>
-        <w:spacing w:after="50" w:line="264" w:lineRule="auto"/>
-        <w:ind w:left="216"/>
-      </w:pPr>
-      <w:r>
-        <w:rPr>
-          <w:b/>
-          <w:color w:val="0284C7"/>
-          <w:sz w:val="17"/>
-        </w:rPr>
-        <w:t>▪</w:t>
-      </w:r>
-      <w:r>
-        <w:rPr>
-          <w:b/>
-          <w:color w:val="0284C7"/>
-          <w:sz w:val="17"/>
-        </w:rPr>
-        <w:t xml:space="preserve">  </w:t>
-      </w:r>
-      <w:r>
-        <w:rPr>
-          <w:b/>
-          <w:color w:val="0A1128"/>
-          <w:sz w:val="17"/>
-        </w:rPr>
-        <w:t xml:space="preserve">Rigor, Ethics &amp; Operational Crisis Management: </w:t>
-      </w:r>
-      <w:r>
-        <w:rPr>
-          <w:color w:val="27374D"/>
-          <w:sz w:val="17"/>
-        </w:rPr>
-        <w:t>In</w:t>
-      </w:r>
-      <w:r>
-        <w:rPr>
-          <w:color w:val="27374D"/>
-          <w:sz w:val="17"/>
-        </w:rPr>
-        <w:t xml:space="preserve"> addition to my AI expertise, my background as an Aviation Security Officer (AVSEC) at the Cameroon Civil Aviation Authority has instilled a deep respect for strict international regulatory frameworks (ICAO Annex 17), crisis coordination, and high-pressure</w:t>
-      </w:r>
-      <w:r>
-        <w:rPr>
-          <w:color w:val="27374D"/>
-          <w:sz w:val="17"/>
-        </w:rPr>
-        <w:t xml:space="preserve"> delivery. I apply this operational discipline to AI governance, emphasizing explainability (SHAP Sentinel Audit), fairness, and responsible data policies.</w:t>
-      </w:r>
-    </w:p>
-    <w:p>
-      <w:pPr>
-        <w:spacing w:after="70" w:line="269" w:lineRule="auto"/>
-      </w:pPr>
-      <w:r>
-        <w:rPr>
-          <w:rFonts w:ascii="Segoe UI" w:hAnsi="Segoe UI"/>
-          <w:color w:val="27374D"/>
-          <w:sz w:val="17"/>
-        </w:rPr>
-        <w:t>Joining the UNDP DAI Hub represents an exceptional opportunity to put cutting-edge technology at the</w:t>
-      </w:r>
-      <w:r>
-        <w:rPr>
-          <w:rFonts w:ascii="Segoe UI" w:hAnsi="Segoe UI"/>
-          <w:color w:val="27374D"/>
-          <w:sz w:val="17"/>
-        </w:rPr>
-        <w:t xml:space="preserve"> service of Country Offices, local communities, and multilateral digital transformation. Available for a 3-month home-based arrangement, I am prepared to contribute immediately with dedication, cultural adaptability, and high energy.</w:t>
-      </w:r>
-    </w:p>
-    <w:p>
-      <w:pPr>
-        <w:spacing w:after="80" w:line="269" w:lineRule="auto"/>
-      </w:pPr>
-      <w:r>
-        <w:rPr>
-          <w:rFonts w:ascii="Segoe UI" w:hAnsi="Segoe UI"/>
-          <w:color w:val="27374D"/>
-          <w:sz w:val="17"/>
-        </w:rPr>
-        <w:t>Thank you very much fo</w:t>
-      </w:r>
-      <w:r>
-        <w:rPr>
-          <w:rFonts w:ascii="Segoe UI" w:hAnsi="Segoe UI"/>
-          <w:color w:val="27374D"/>
-          <w:sz w:val="17"/>
-        </w:rPr>
-        <w:t>r your time and consideration. I welcome the opportunity to discuss my application with you.</w:t>
+        <w:t xml:space="preserve"> for your consideration. I look forward to the opportunity to discuss my application with you.</w:t>
       </w:r>
     </w:p>
     <w:p>
@@ -398,7 +429,7 @@
         <w:rPr>
           <w:rFonts w:ascii="Segoe UI" w:hAnsi="Segoe UI"/>
           <w:color w:val="0A1128"/>
-          <w:sz w:val="17"/>
+          <w:sz w:val="18"/>
         </w:rPr>
         <w:t>Sincerely,</w:t>
       </w:r>
@@ -412,7 +443,7 @@
           <w:rFonts w:ascii="Segoe UI" w:hAnsi="Segoe UI"/>
           <w:b/>
           <w:color w:val="0A1128"/>
-          <w:sz w:val="19"/>
+          <w:sz w:val="21"/>
         </w:rPr>
         <w:t>KOA MARIE GERVAIS NELLY</w:t>
       </w:r>
@@ -425,9 +456,9 @@
         <w:rPr>
           <w:rFonts w:ascii="Segoe UI" w:hAnsi="Segoe UI"/>
           <w:color w:val="0284C7"/>
-          <w:sz w:val="16"/>
+          <w:sz w:val="17"/>
         </w:rPr>
-        <w:t>Lead AI Engineer &amp; Graduate Student in Applied AI  │  Founder @ Archi Cam AI</w:t>
+        <w:t>Lead AI Engineer &amp; Master's Candidate in Applied AI  │  Founder @ Archi Cam AI</w:t>
       </w:r>
     </w:p>
     <w:p>
@@ -441,7 +472,7 @@
     </w:p>
     <w:sectPr>
       <w:pgSz w:w="11909" w:h="16834"/>
-      <w:pgMar w:top="936" w:right="1080" w:bottom="936" w:left="1080" w:header="720" w:footer="720" w:gutter="0"/>
+      <w:pgMar w:top="792" w:right="1008" w:bottom="792" w:left="1008" w:header="720" w:footer="720" w:gutter="0"/>
       <w:cols w:space="720"/>
       <w:docGrid w:linePitch="360"/>
     </w:sectPr>
@@ -13048,7 +13079,7 @@
 </file>
 
 <file path=customXml/itemProps1.xml><?xml version="1.0" encoding="utf-8"?>
-<ds:datastoreItem xmlns:ds="http://schemas.openxmlformats.org/officeDocument/2006/customXml" ds:itemID="{8A138EC8-EA46-4AAD-B394-A9A79D8A7018}">
+<ds:datastoreItem xmlns:ds="http://schemas.openxmlformats.org/officeDocument/2006/customXml" ds:itemID="{6043D4EC-5427-454B-8F2B-B84639C8F994}">
   <ds:schemaRefs>
     <ds:schemaRef ds:uri="http://schemas.openxmlformats.org/officeDocument/2006/bibliography"/>
   </ds:schemaRefs>

</xml_diff>

<commit_message>
docs: enlarge Cover Letter font to 9.8pt, add GitHub to header, fill A4 page completely (1-page verified)
</commit_message>
<xml_diff>
--- a/KOA_MARIE_GERVAIS_NELLY_COVER_LETTER_UNDP.docx
+++ b/KOA_MARIE_GERVAIS_NELLY_COVER_LETTER_UNDP.docx
@@ -13,7 +13,7 @@
           <w:rFonts w:ascii="Segoe UI" w:hAnsi="Segoe UI"/>
           <w:b/>
           <w:color w:val="0A1128"/>
-          <w:sz w:val="38"/>
+          <w:sz w:val="42"/>
         </w:rPr>
         <w:t>KOA MARIE GERVAIS NELLY</w:t>
       </w:r>
@@ -27,14 +27,14 @@
           <w:rFonts w:ascii="Segoe UI" w:hAnsi="Segoe UI"/>
           <w:b/>
           <w:color w:val="0284C7"/>
-          <w:sz w:val="20"/>
+          <w:sz w:val="21"/>
         </w:rPr>
         <w:t>Lead AI Engineer &amp; Data Architect   │   M.Sc. Candidate in Applied AI</w:t>
       </w:r>
     </w:p>
     <w:p>
       <w:pPr>
-        <w:spacing w:after="80"/>
+        <w:spacing w:after="90"/>
       </w:pPr>
       <w:r>
         <w:rPr>
@@ -42,26 +42,19 @@
           <w:color w:val="475569"/>
           <w:sz w:val="17"/>
         </w:rPr>
-        <w:t>Douala / Ngaoundéré, Cameroon   •   magenel85@gmail.com   •   +237 695 35 34 02   •   linkedin.com/in/marie-gervais-koa</w:t>
+        <w:t>Douala / Ngaoundéré, Cameroon   •   magenel85@gmail.com   •   +237 695 35 34 02   •   github.com/gervais-afk   •   linkedin.com/in/marie-gervais-koa</w:t>
       </w:r>
     </w:p>
     <w:p>
       <w:pPr>
-        <w:spacing w:after="120"/>
+        <w:spacing w:after="140"/>
       </w:pPr>
       <w:r>
         <w:rPr>
           <w:color w:val="0284C7"/>
           <w:sz w:val="9"/>
         </w:rPr>
-        <w:t>━━━━━━━━━━━━━━━━━━━━━━━━━</w:t>
-      </w:r>
-      <w:r>
-        <w:rPr>
-          <w:color w:val="0284C7"/>
-          <w:sz w:val="9"/>
-        </w:rPr>
-        <w:t>─────────────────────────────────────────────</w:t>
+        <w:t>━━━━━━━━━━━━━━━━━━━━━━━━━━──────────────────────────────────────────────</w:t>
       </w:r>
     </w:p>
     <w:p>
@@ -73,14 +66,14 @@
           <w:rFonts w:ascii="Segoe UI" w:hAnsi="Segoe UI"/>
           <w:b/>
           <w:color w:val="0A1128"/>
-          <w:sz w:val="18"/>
+          <w:sz w:val="19"/>
         </w:rPr>
         <w:t>September 4, 2026</w:t>
       </w:r>
     </w:p>
     <w:p>
       <w:pPr>
-        <w:spacing w:after="90" w:line="274" w:lineRule="auto"/>
+        <w:spacing w:after="100"/>
       </w:pPr>
       <w:r>
         <w:rPr>
@@ -132,7 +125,7 @@
           <w:color w:val="0A1128"/>
           <w:sz w:val="18"/>
         </w:rPr>
-        <w:t>Job Identification: 33001 — Digital,</w:t>
+        <w:t>Job Ident</w:t>
       </w:r>
       <w:r>
         <w:rPr>
@@ -141,263 +134,21 @@
           <w:color w:val="0A1128"/>
           <w:sz w:val="18"/>
         </w:rPr>
-        <w:t xml:space="preserve"> AI and Innovation Internship: Global Call for 2026</w:t>
+        <w:t>ification: 33001 — Digital, AI and Innovation Internship: Global Call for 2026</w:t>
       </w:r>
     </w:p>
     <w:p>
       <w:pPr>
-        <w:spacing w:before="40" w:after="90"/>
+        <w:spacing w:before="40" w:after="100"/>
       </w:pPr>
       <w:r>
         <w:rPr>
           <w:rFonts w:ascii="Segoe UI" w:hAnsi="Segoe UI"/>
           <w:b/>
           <w:color w:val="0284C7"/>
-          <w:sz w:val="19"/>
+          <w:sz w:val="20"/>
         </w:rPr>
         <w:t>SUBJECT: Application for Digital, AI and Innovation Internship (Home-Based) — Job ID: 33001</w:t>
-      </w:r>
-    </w:p>
-    <w:p>
-      <w:pPr>
-        <w:spacing w:after="70"/>
-      </w:pPr>
-      <w:r>
-        <w:rPr>
-          <w:rFonts w:ascii="Segoe UI" w:hAnsi="Segoe UI"/>
-          <w:color w:val="0A1128"/>
-          <w:sz w:val="18"/>
-        </w:rPr>
-        <w:t>Dear Members of the Selection Committee,</w:t>
-      </w:r>
-    </w:p>
-    <w:p>
-      <w:pPr>
-        <w:spacing w:after="90"/>
-      </w:pPr>
-      <w:r>
-        <w:rPr>
-          <w:rFonts w:ascii="Segoe UI" w:hAnsi="Segoe UI"/>
-          <w:color w:val="1E293B"/>
-          <w:sz w:val="18"/>
-        </w:rPr>
-        <w:t xml:space="preserve">I am writing to submit my enthusiastic application for the Digital, AI </w:t>
-      </w:r>
-      <w:r>
-        <w:rPr>
-          <w:rFonts w:ascii="Segoe UI" w:hAnsi="Segoe UI"/>
-          <w:color w:val="1E293B"/>
-          <w:sz w:val="18"/>
-        </w:rPr>
-        <w:t>and Innovation Internship (Job ID: 33001) within UNDP's Bureau for Policy and Programme Support (BPPS). Currently enrolled in a Master's Degree in Applied Artificial Intelligence at the University of Ngaoundéré (Dec. 2025 – 2027) with a prior Civil Enginee</w:t>
-      </w:r>
-      <w:r>
-        <w:rPr>
-          <w:rFonts w:ascii="Segoe UI" w:hAnsi="Segoe UI"/>
-          <w:color w:val="1E293B"/>
-          <w:sz w:val="18"/>
-        </w:rPr>
-        <w:t>ring degree (B.Sc.), this 3-month home-based internship directly fulfills my postgraduate degree's mandatory internship curriculum requirement. It also represents a premier opportunity to place my expertise in sovereign AI systems, data engineering, and di</w:t>
-      </w:r>
-      <w:r>
-        <w:rPr>
-          <w:rFonts w:ascii="Segoe UI" w:hAnsi="Segoe UI"/>
-          <w:color w:val="1E293B"/>
-          <w:sz w:val="18"/>
-        </w:rPr>
-        <w:t>gital public goods at the service of UNDP's mission to accelerate the Sustainable Development Goals (SDGs).</w:t>
-      </w:r>
-    </w:p>
-    <w:p>
-      <w:pPr>
-        <w:spacing w:after="64" w:line="271" w:lineRule="auto"/>
-        <w:ind w:left="216"/>
-      </w:pPr>
-      <w:r>
-        <w:rPr>
-          <w:rFonts w:ascii="Segoe UI" w:hAnsi="Segoe UI"/>
-          <w:b/>
-          <w:color w:val="0284C7"/>
-          <w:sz w:val="18"/>
-        </w:rPr>
-        <w:t>▪</w:t>
-      </w:r>
-      <w:r>
-        <w:rPr>
-          <w:rFonts w:ascii="Segoe UI" w:hAnsi="Segoe UI"/>
-          <w:b/>
-          <w:color w:val="0284C7"/>
-          <w:sz w:val="18"/>
-        </w:rPr>
-        <w:t xml:space="preserve">  </w:t>
-      </w:r>
-      <w:r>
-        <w:rPr>
-          <w:rFonts w:ascii="Segoe UI" w:hAnsi="Segoe UI"/>
-          <w:b/>
-          <w:color w:val="0A1128"/>
-          <w:sz w:val="18"/>
-        </w:rPr>
-        <w:t xml:space="preserve">AI Product Build &amp; Systems Innovation: </w:t>
-      </w:r>
-      <w:r>
-        <w:rPr>
-          <w:rFonts w:ascii="Segoe UI" w:hAnsi="Segoe UI"/>
-          <w:color w:val="1E293B"/>
-          <w:sz w:val="18"/>
-        </w:rPr>
-        <w:t>As founder of Archi Cam AI (official applicant to the Google Africa Applied AI Lab 2026), I built an agent</w:t>
-      </w:r>
-      <w:r>
-        <w:rPr>
-          <w:rFonts w:ascii="Segoe UI" w:hAnsi="Segoe UI"/>
-          <w:color w:val="1E293B"/>
-          <w:sz w:val="18"/>
-        </w:rPr>
-        <w:t>ic platform combining Gemma and Gemini LLMs with 5D BIM standards to automate construction estimation and planning in &lt;45s (R²=0.9872). Furthermore, as an applied Master 1 research project, I engineered K1-MATHINFO v3, a sovereign multi-agent GraphRAG arch</w:t>
-      </w:r>
-      <w:r>
-        <w:rPr>
-          <w:rFonts w:ascii="Segoe UI" w:hAnsi="Segoe UI"/>
-          <w:color w:val="1E293B"/>
-          <w:sz w:val="18"/>
-        </w:rPr>
-        <w:t>itecture indexing 470 academic theses with Neo4j and LangGraph, incorporating Open Knowledge Framework (OKF) zero-hallucination verification.</w:t>
-      </w:r>
-    </w:p>
-    <w:p>
-      <w:pPr>
-        <w:spacing w:after="64" w:line="271" w:lineRule="auto"/>
-        <w:ind w:left="216"/>
-      </w:pPr>
-      <w:r>
-        <w:rPr>
-          <w:rFonts w:ascii="Segoe UI" w:hAnsi="Segoe UI"/>
-          <w:b/>
-          <w:color w:val="0284C7"/>
-          <w:sz w:val="18"/>
-        </w:rPr>
-        <w:t>▪</w:t>
-      </w:r>
-      <w:r>
-        <w:rPr>
-          <w:rFonts w:ascii="Segoe UI" w:hAnsi="Segoe UI"/>
-          <w:b/>
-          <w:color w:val="0284C7"/>
-          <w:sz w:val="18"/>
-        </w:rPr>
-        <w:t xml:space="preserve">  </w:t>
-      </w:r>
-      <w:r>
-        <w:rPr>
-          <w:rFonts w:ascii="Segoe UI" w:hAnsi="Segoe UI"/>
-          <w:b/>
-          <w:color w:val="0A1128"/>
-          <w:sz w:val="18"/>
-        </w:rPr>
-        <w:t xml:space="preserve">Data-Driven Impact for Climate &amp; Vulnerable Communities: </w:t>
-      </w:r>
-      <w:r>
-        <w:rPr>
-          <w:rFonts w:ascii="Segoe UI" w:hAnsi="Segoe UI"/>
-          <w:color w:val="1E293B"/>
-          <w:sz w:val="18"/>
-        </w:rPr>
-        <w:t>Dedicated to the 'Leave No One Behind' principle, I co</w:t>
-      </w:r>
-      <w:r>
-        <w:rPr>
-          <w:rFonts w:ascii="Segoe UI" w:hAnsi="Segoe UI"/>
-          <w:color w:val="1E293B"/>
-          <w:sz w:val="18"/>
-        </w:rPr>
-        <w:t>-developed VigieSahel, an agro-climatic forecasting system combining XGBoost predictive models and Supabase to reduce crop seeding losses by 35% and anticipate epidemic risks by 14 days in the Sahel region. Additionally, through Dataset Automator (Google C</w:t>
-      </w:r>
-      <w:r>
-        <w:rPr>
-          <w:rFonts w:ascii="Segoe UI" w:hAnsi="Segoe UI"/>
-          <w:color w:val="1E293B"/>
-          <w:sz w:val="18"/>
-        </w:rPr>
-        <w:t>loud Hackathon), I implemented MLOps pipelines with KS/PSI data drift tracking and EU AI Act alignment frameworks.</w:t>
-      </w:r>
-    </w:p>
-    <w:p>
-      <w:pPr>
-        <w:spacing w:after="64" w:line="271" w:lineRule="auto"/>
-        <w:ind w:left="216"/>
-      </w:pPr>
-      <w:r>
-        <w:rPr>
-          <w:rFonts w:ascii="Segoe UI" w:hAnsi="Segoe UI"/>
-          <w:b/>
-          <w:color w:val="0284C7"/>
-          <w:sz w:val="18"/>
-        </w:rPr>
-        <w:t>▪</w:t>
-      </w:r>
-      <w:r>
-        <w:rPr>
-          <w:rFonts w:ascii="Segoe UI" w:hAnsi="Segoe UI"/>
-          <w:b/>
-          <w:color w:val="0284C7"/>
-          <w:sz w:val="18"/>
-        </w:rPr>
-        <w:t xml:space="preserve">  </w:t>
-      </w:r>
-      <w:r>
-        <w:rPr>
-          <w:rFonts w:ascii="Segoe UI" w:hAnsi="Segoe UI"/>
-          <w:b/>
-          <w:color w:val="0A1128"/>
-          <w:sz w:val="18"/>
-        </w:rPr>
-        <w:t xml:space="preserve">Institutional Rigor, Ethics &amp; Public Service Integrity: </w:t>
-      </w:r>
-      <w:r>
-        <w:rPr>
-          <w:rFonts w:ascii="Segoe UI" w:hAnsi="Segoe UI"/>
-          <w:color w:val="1E293B"/>
-          <w:sz w:val="18"/>
-        </w:rPr>
-        <w:t>In addition to my AI capabilities, my service as an Aviation Security Officer (AVS</w:t>
-      </w:r>
-      <w:r>
-        <w:rPr>
-          <w:rFonts w:ascii="Segoe UI" w:hAnsi="Segoe UI"/>
-          <w:color w:val="1E293B"/>
-          <w:sz w:val="18"/>
-        </w:rPr>
-        <w:t xml:space="preserve">EC) at the Cameroon Civil Aviation Authority (CCAA) has instilled uncompromising discipline and crisis management readiness. In recognition of this dedication, I was awarded the official Certificate of Excellence for Performance and Integrity (April 2023) </w:t>
-      </w:r>
-      <w:r>
-        <w:rPr>
-          <w:rFonts w:ascii="Segoe UI" w:hAnsi="Segoe UI"/>
-          <w:color w:val="1E293B"/>
-          <w:sz w:val="18"/>
-        </w:rPr>
-        <w:t>by the Director General of CCAA. I bring this proven public-service integrity to AI governance, emphasizing explainability (SHAP Sentinel Audit), fairness, and responsible data policy.</w:t>
-      </w:r>
-    </w:p>
-    <w:p>
-      <w:pPr>
-        <w:spacing w:after="90"/>
-      </w:pPr>
-      <w:r>
-        <w:rPr>
-          <w:rFonts w:ascii="Segoe UI" w:hAnsi="Segoe UI"/>
-          <w:color w:val="1E293B"/>
-          <w:sz w:val="18"/>
-        </w:rPr>
-        <w:t>Joining the UNDP DAI Hub is an exceptional opportunity to translate cut</w:t>
-      </w:r>
-      <w:r>
-        <w:rPr>
-          <w:rFonts w:ascii="Segoe UI" w:hAnsi="Segoe UI"/>
-          <w:color w:val="1E293B"/>
-          <w:sz w:val="18"/>
-        </w:rPr>
-        <w:t>ting-edge AI research into scalable, inclusive development solutions for Country Offices. Available immediately for a 3-month remote arrangement, I am eager to contribute with technical rigor, intercultural agility, and high dedication.</w:t>
       </w:r>
     </w:p>
     <w:p>
@@ -407,29 +158,271 @@
       <w:r>
         <w:rPr>
           <w:rFonts w:ascii="Segoe UI" w:hAnsi="Segoe UI"/>
+          <w:color w:val="0A1128"/>
+          <w:sz w:val="19"/>
+        </w:rPr>
+        <w:t>Dear Members of the Selection Committee,</w:t>
+      </w:r>
+    </w:p>
+    <w:p>
+      <w:pPr>
+        <w:spacing w:after="110" w:line="283" w:lineRule="auto"/>
+      </w:pPr>
+      <w:r>
+        <w:rPr>
+          <w:rFonts w:ascii="Segoe UI" w:hAnsi="Segoe UI"/>
           <w:color w:val="1E293B"/>
-          <w:sz w:val="18"/>
+          <w:sz w:val="19"/>
         </w:rPr>
-        <w:t>Thank you very much</w:t>
+        <w:t>I am writing to submit my enthusiastic appli</w:t>
       </w:r>
       <w:r>
         <w:rPr>
           <w:rFonts w:ascii="Segoe UI" w:hAnsi="Segoe UI"/>
           <w:color w:val="1E293B"/>
-          <w:sz w:val="18"/>
+          <w:sz w:val="19"/>
         </w:rPr>
-        <w:t xml:space="preserve"> for your consideration. I look forward to the opportunity to discuss my application with you.</w:t>
+        <w:t>cation for the Digital, AI and Innovation Internship (Job ID: 33001) within UNDP's Bureau for Policy and Programme Support (BPPS). Currently enrolled in a Master's Degree in Applied Artificial Intelligence at the University of Ngaoundéré (Dec. 2025 – 2027)</w:t>
+      </w:r>
+      <w:r>
+        <w:rPr>
+          <w:rFonts w:ascii="Segoe UI" w:hAnsi="Segoe UI"/>
+          <w:color w:val="1E293B"/>
+          <w:sz w:val="19"/>
+        </w:rPr>
+        <w:t xml:space="preserve"> with a prior Civil Engineering degree (B.Sc.), this 3-month home-based internship directly fulfills my postgraduate degree's mandatory internship curriculum requirement. It also represents a premier opportunity to place my expertise in sovereign AI system</w:t>
+      </w:r>
+      <w:r>
+        <w:rPr>
+          <w:rFonts w:ascii="Segoe UI" w:hAnsi="Segoe UI"/>
+          <w:color w:val="1E293B"/>
+          <w:sz w:val="19"/>
+        </w:rPr>
+        <w:t>s, data engineering, and digital public goods at the service of UNDP's mission to accelerate the Sustainable Development Goals (SDGs).</w:t>
       </w:r>
     </w:p>
     <w:p>
       <w:pPr>
-        <w:spacing w:after="20"/>
+        <w:spacing w:after="90" w:line="278" w:lineRule="auto"/>
+        <w:ind w:left="259"/>
+      </w:pPr>
+      <w:r>
+        <w:rPr>
+          <w:rFonts w:ascii="Segoe UI" w:hAnsi="Segoe UI"/>
+          <w:b/>
+          <w:color w:val="0284C7"/>
+          <w:sz w:val="19"/>
+        </w:rPr>
+        <w:t>▪</w:t>
+      </w:r>
+      <w:r>
+        <w:rPr>
+          <w:rFonts w:ascii="Segoe UI" w:hAnsi="Segoe UI"/>
+          <w:b/>
+          <w:color w:val="0284C7"/>
+          <w:sz w:val="19"/>
+        </w:rPr>
+        <w:t xml:space="preserve">  </w:t>
+      </w:r>
+      <w:r>
+        <w:rPr>
+          <w:rFonts w:ascii="Segoe UI" w:hAnsi="Segoe UI"/>
+          <w:b/>
+          <w:color w:val="0A1128"/>
+          <w:sz w:val="19"/>
+        </w:rPr>
+        <w:t xml:space="preserve">AI Product Build &amp; Systems Innovation: </w:t>
+      </w:r>
+      <w:r>
+        <w:rPr>
+          <w:rFonts w:ascii="Segoe UI" w:hAnsi="Segoe UI"/>
+          <w:color w:val="1E293B"/>
+          <w:sz w:val="19"/>
+        </w:rPr>
+        <w:t xml:space="preserve">As founder of Archi Cam AI (official applicant to the Google Africa Applied AI </w:t>
+      </w:r>
+      <w:r>
+        <w:rPr>
+          <w:rFonts w:ascii="Segoe UI" w:hAnsi="Segoe UI"/>
+          <w:color w:val="1E293B"/>
+          <w:sz w:val="19"/>
+        </w:rPr>
+        <w:t>Lab 2026), I built an agentic platform combining Gemma and Gemini LLMs with 5D BIM standards to automate construction estimation and planning in &lt;45s (R²=0.9872). Furthermore, as an applied Master 1 research project, I engineered K1-MATHINFO v3, a sovereig</w:t>
+      </w:r>
+      <w:r>
+        <w:rPr>
+          <w:rFonts w:ascii="Segoe UI" w:hAnsi="Segoe UI"/>
+          <w:color w:val="1E293B"/>
+          <w:sz w:val="19"/>
+        </w:rPr>
+        <w:t>n multi-agent GraphRAG architecture indexing 470 academic theses with Neo4j and LangGraph, incorporating Open Knowledge Framework (OKF) zero-hallucination verification.</w:t>
+      </w:r>
+    </w:p>
+    <w:p>
+      <w:pPr>
+        <w:spacing w:after="90" w:line="278" w:lineRule="auto"/>
+        <w:ind w:left="259"/>
+      </w:pPr>
+      <w:r>
+        <w:rPr>
+          <w:rFonts w:ascii="Segoe UI" w:hAnsi="Segoe UI"/>
+          <w:b/>
+          <w:color w:val="0284C7"/>
+          <w:sz w:val="19"/>
+        </w:rPr>
+        <w:t>▪</w:t>
+      </w:r>
+      <w:r>
+        <w:rPr>
+          <w:rFonts w:ascii="Segoe UI" w:hAnsi="Segoe UI"/>
+          <w:b/>
+          <w:color w:val="0284C7"/>
+          <w:sz w:val="19"/>
+        </w:rPr>
+        <w:t xml:space="preserve">  </w:t>
+      </w:r>
+      <w:r>
+        <w:rPr>
+          <w:rFonts w:ascii="Segoe UI" w:hAnsi="Segoe UI"/>
+          <w:b/>
+          <w:color w:val="0A1128"/>
+          <w:sz w:val="19"/>
+        </w:rPr>
+        <w:t xml:space="preserve">Data-Driven Impact for Climate &amp; Vulnerable Communities: </w:t>
+      </w:r>
+      <w:r>
+        <w:rPr>
+          <w:rFonts w:ascii="Segoe UI" w:hAnsi="Segoe UI"/>
+          <w:color w:val="1E293B"/>
+          <w:sz w:val="19"/>
+        </w:rPr>
+        <w:t xml:space="preserve">Dedicated to the 'Leave No </w:t>
+      </w:r>
+      <w:r>
+        <w:rPr>
+          <w:rFonts w:ascii="Segoe UI" w:hAnsi="Segoe UI"/>
+          <w:color w:val="1E293B"/>
+          <w:sz w:val="19"/>
+        </w:rPr>
+        <w:t xml:space="preserve">One Behind' principle, I co-developed VigieSahel, an agro-climatic forecasting system combining XGBoost predictive models and Supabase to reduce crop seeding losses by 35% and anticipate epidemic risks by 14 days in the Sahel region. Additionally, through </w:t>
+      </w:r>
+      <w:r>
+        <w:rPr>
+          <w:rFonts w:ascii="Segoe UI" w:hAnsi="Segoe UI"/>
+          <w:color w:val="1E293B"/>
+          <w:sz w:val="19"/>
+        </w:rPr>
+        <w:t>Dataset Automator (Google Cloud Hackathon), I implemented MLOps pipelines with KS/PSI data drift tracking and EU AI Act alignment frameworks.</w:t>
+      </w:r>
+    </w:p>
+    <w:p>
+      <w:pPr>
+        <w:spacing w:after="90" w:line="278" w:lineRule="auto"/>
+        <w:ind w:left="259"/>
+      </w:pPr>
+      <w:r>
+        <w:rPr>
+          <w:rFonts w:ascii="Segoe UI" w:hAnsi="Segoe UI"/>
+          <w:b/>
+          <w:color w:val="0284C7"/>
+          <w:sz w:val="19"/>
+        </w:rPr>
+        <w:t>▪</w:t>
+      </w:r>
+      <w:r>
+        <w:rPr>
+          <w:rFonts w:ascii="Segoe UI" w:hAnsi="Segoe UI"/>
+          <w:b/>
+          <w:color w:val="0284C7"/>
+          <w:sz w:val="19"/>
+        </w:rPr>
+        <w:t xml:space="preserve">  </w:t>
+      </w:r>
+      <w:r>
+        <w:rPr>
+          <w:rFonts w:ascii="Segoe UI" w:hAnsi="Segoe UI"/>
+          <w:b/>
+          <w:color w:val="0A1128"/>
+          <w:sz w:val="19"/>
+        </w:rPr>
+        <w:t xml:space="preserve">Institutional Rigor, Ethics &amp; Public Service Integrity: </w:t>
+      </w:r>
+      <w:r>
+        <w:rPr>
+          <w:rFonts w:ascii="Segoe UI" w:hAnsi="Segoe UI"/>
+          <w:color w:val="1E293B"/>
+          <w:sz w:val="19"/>
+        </w:rPr>
+        <w:t>In addition to my AI capabilities, my service as an Avi</w:t>
+      </w:r>
+      <w:r>
+        <w:rPr>
+          <w:rFonts w:ascii="Segoe UI" w:hAnsi="Segoe UI"/>
+          <w:color w:val="1E293B"/>
+          <w:sz w:val="19"/>
+        </w:rPr>
+        <w:t xml:space="preserve">ation Security Officer (AVSEC) at the Cameroon Civil Aviation Authority (CCAA) has instilled uncompromising discipline and crisis management readiness. In recognition of this dedication, I was awarded the official Certificate of Excellence for Performance </w:t>
+      </w:r>
+      <w:r>
+        <w:rPr>
+          <w:rFonts w:ascii="Segoe UI" w:hAnsi="Segoe UI"/>
+          <w:color w:val="1E293B"/>
+          <w:sz w:val="19"/>
+        </w:rPr>
+        <w:t>and Integrity (April 2023) by the Director General of CCAA. I bring this proven public-service integrity to AI governance, emphasizing explainability (SHAP Sentinel Audit), fairness, and responsible data policy.</w:t>
+      </w:r>
+    </w:p>
+    <w:p>
+      <w:pPr>
+        <w:spacing w:after="110" w:line="283" w:lineRule="auto"/>
+      </w:pPr>
+      <w:r>
+        <w:rPr>
+          <w:rFonts w:ascii="Segoe UI" w:hAnsi="Segoe UI"/>
+          <w:color w:val="1E293B"/>
+          <w:sz w:val="19"/>
+        </w:rPr>
+        <w:t>Joining the UNDP DAI Hub is an exceptional o</w:t>
+      </w:r>
+      <w:r>
+        <w:rPr>
+          <w:rFonts w:ascii="Segoe UI" w:hAnsi="Segoe UI"/>
+          <w:color w:val="1E293B"/>
+          <w:sz w:val="19"/>
+        </w:rPr>
+        <w:t>pportunity to translate cutting-edge AI research into scalable, inclusive development solutions for Country Offices. Available immediately for a 3-month remote arrangement, I am eager to contribute with technical rigor, intercultural agility, and high dedi</w:t>
+      </w:r>
+      <w:r>
+        <w:rPr>
+          <w:rFonts w:ascii="Segoe UI" w:hAnsi="Segoe UI"/>
+          <w:color w:val="1E293B"/>
+          <w:sz w:val="19"/>
+        </w:rPr>
+        <w:t>cation.</w:t>
+      </w:r>
+    </w:p>
+    <w:p>
+      <w:pPr>
+        <w:spacing w:after="110" w:line="283" w:lineRule="auto"/>
+      </w:pPr>
+      <w:r>
+        <w:rPr>
+          <w:rFonts w:ascii="Segoe UI" w:hAnsi="Segoe UI"/>
+          <w:color w:val="1E293B"/>
+          <w:sz w:val="19"/>
+        </w:rPr>
+        <w:t>Thank you very much for your consideration. I look forward to the opportunity to discuss my application with you.</w:t>
+      </w:r>
+    </w:p>
+    <w:p>
+      <w:pPr>
+        <w:spacing w:after="30"/>
       </w:pPr>
       <w:r>
         <w:rPr>
           <w:rFonts w:ascii="Segoe UI" w:hAnsi="Segoe UI"/>
           <w:color w:val="0A1128"/>
-          <w:sz w:val="18"/>
+          <w:sz w:val="19"/>
         </w:rPr>
         <w:t>Sincerely,</w:t>
       </w:r>
@@ -443,7 +436,6 @@
           <w:rFonts w:ascii="Segoe UI" w:hAnsi="Segoe UI"/>
           <w:b/>
           <w:color w:val="0A1128"/>
-          <w:sz w:val="21"/>
         </w:rPr>
         <w:t>KOA MARIE GERVAIS NELLY</w:t>
       </w:r>
@@ -456,7 +448,7 @@
         <w:rPr>
           <w:rFonts w:ascii="Segoe UI" w:hAnsi="Segoe UI"/>
           <w:color w:val="0284C7"/>
-          <w:sz w:val="17"/>
+          <w:sz w:val="18"/>
         </w:rPr>
         <w:t>Lead AI Engineer &amp; Master's Candidate in Applied AI  │  Founder @ Archi Cam AI</w:t>
       </w:r>
@@ -472,7 +464,7 @@
     </w:p>
     <w:sectPr>
       <w:pgSz w:w="11909" w:h="16834"/>
-      <w:pgMar w:top="792" w:right="1008" w:bottom="792" w:left="1008" w:header="720" w:footer="720" w:gutter="0"/>
+      <w:pgMar w:top="749" w:right="979" w:bottom="749" w:left="979" w:header="720" w:footer="720" w:gutter="0"/>
       <w:cols w:space="720"/>
       <w:docGrid w:linePitch="360"/>
     </w:sectPr>
@@ -13079,7 +13071,7 @@
 </file>
 
 <file path=customXml/itemProps1.xml><?xml version="1.0" encoding="utf-8"?>
-<ds:datastoreItem xmlns:ds="http://schemas.openxmlformats.org/officeDocument/2006/customXml" ds:itemID="{6043D4EC-5427-454B-8F2B-B84639C8F994}">
+<ds:datastoreItem xmlns:ds="http://schemas.openxmlformats.org/officeDocument/2006/customXml" ds:itemID="{F1DB9E8E-C547-4613-9D03-9C248D512B4E}">
   <ds:schemaRefs>
     <ds:schemaRef ds:uri="http://schemas.openxmlformats.org/officeDocument/2006/bibliography"/>
   </ds:schemaRefs>

</xml_diff>

<commit_message>
Refactor Archi Cam AI branding to creator role and optimize awards across portfolio, CVs and cover letters
</commit_message>
<xml_diff>
--- a/KOA_MARIE_GERVAIS_NELLY_COVER_LETTER_UNDP.docx
+++ b/KOA_MARIE_GERVAIS_NELLY_COVER_LETTER_UNDP.docx
@@ -239,7 +239,7 @@
           <w:color w:val="1E293B"/>
           <w:sz w:val="19"/>
         </w:rPr>
-        <w:t xml:space="preserve">As founder of Archi Cam AI (official applicant to the Google Africa Applied AI </w:t>
+        <w:t>As founder and architect of Archi Cam AI (Agentic AI SaaS &amp; 5D BIM), I built an</w:t>
       </w:r>
       <w:r>
         <w:rPr>
@@ -247,7 +247,7 @@
           <w:color w:val="1E293B"/>
           <w:sz w:val="19"/>
         </w:rPr>
-        <w:t>Lab 2026), I built an agentic platform combining Gemma and Gemini LLMs with 5D BIM standards to automate construction estimation and planning in &lt;45s (R²=0.9872). Furthermore, as an applied Master 1 research project, I engineered K1-MATHINFO v3, a sovereig</w:t>
+        <w:t xml:space="preserve"> agentic platform combining Gemma and Gemini LLMs with 5D BIM standards to automate construction estimation and planning in &lt;45s (R²=0.9872). Furthermore, as an applied Master 1 research project, I engineered K1-MATHINFO v3, a sovereign multi-agent GraphRA</w:t>
       </w:r>
       <w:r>
         <w:rPr>
@@ -255,7 +255,7 @@
           <w:color w:val="1E293B"/>
           <w:sz w:val="19"/>
         </w:rPr>
-        <w:t>n multi-agent GraphRAG architecture indexing 470 academic theses with Neo4j and LangGraph, incorporating Open Knowledge Framework (OKF) zero-hallucination verification.</w:t>
+        <w:t>G architecture indexing 470 academic theses with Neo4j and LangGraph, incorporating Open Knowledge Framework (OKF) zero-hallucination verification.</w:t>
       </w:r>
     </w:p>
     <w:p>
@@ -296,7 +296,7 @@
           <w:color w:val="1E293B"/>
           <w:sz w:val="19"/>
         </w:rPr>
-        <w:t xml:space="preserve">Dedicated to the 'Leave No </w:t>
+        <w:t>Dedicated to the 'Leave No One Behind' principle</w:t>
       </w:r>
       <w:r>
         <w:rPr>
@@ -304,7 +304,7 @@
           <w:color w:val="1E293B"/>
           <w:sz w:val="19"/>
         </w:rPr>
-        <w:t xml:space="preserve">One Behind' principle, I co-developed VigieSahel, an agro-climatic forecasting system combining XGBoost predictive models and Supabase to reduce crop seeding losses by 35% and anticipate epidemic risks by 14 days in the Sahel region. Additionally, through </w:t>
+        <w:t>, I co-developed VigieSahel, an agro-climatic forecasting system combining XGBoost predictive models and Supabase to reduce crop seeding losses by 35% and anticipate epidemic risks by 14 days in the Sahel region. Additionally, through Dataset Automator (Go</w:t>
       </w:r>
       <w:r>
         <w:rPr>
@@ -312,7 +312,7 @@
           <w:color w:val="1E293B"/>
           <w:sz w:val="19"/>
         </w:rPr>
-        <w:t>Dataset Automator (Google Cloud Hackathon), I implemented MLOps pipelines with KS/PSI data drift tracking and EU AI Act alignment frameworks.</w:t>
+        <w:t>ogle Cloud Hackathon), I implemented MLOps pipelines with KS/PSI data drift tracking and EU AI Act alignment frameworks.</w:t>
       </w:r>
     </w:p>
     <w:p>
@@ -353,7 +353,7 @@
           <w:color w:val="1E293B"/>
           <w:sz w:val="19"/>
         </w:rPr>
-        <w:t>In addition to my AI capabilities, my service as an Avi</w:t>
+        <w:t>In addition to my AI capabilities, my service as an Aviation Security Office</w:t>
       </w:r>
       <w:r>
         <w:rPr>
@@ -361,7 +361,7 @@
           <w:color w:val="1E293B"/>
           <w:sz w:val="19"/>
         </w:rPr>
-        <w:t xml:space="preserve">ation Security Officer (AVSEC) at the Cameroon Civil Aviation Authority (CCAA) has instilled uncompromising discipline and crisis management readiness. In recognition of this dedication, I was awarded the official Certificate of Excellence for Performance </w:t>
+        <w:t xml:space="preserve">r (AVSEC) at the Cameroon Civil Aviation Authority (CCAA) has instilled uncompromising discipline and crisis management readiness. In recognition of this dedication, I was awarded the official Certificate of Excellence for Performance and Integrity (April </w:t>
       </w:r>
       <w:r>
         <w:rPr>
@@ -369,7 +369,7 @@
           <w:color w:val="1E293B"/>
           <w:sz w:val="19"/>
         </w:rPr>
-        <w:t>and Integrity (April 2023) by the Director General of CCAA. I bring this proven public-service integrity to AI governance, emphasizing explainability (SHAP Sentinel Audit), fairness, and responsible data policy.</w:t>
+        <w:t>2023) by the Director General of CCAA. I bring this proven public-service integrity to AI governance, emphasizing explainability (SHAP Sentinel Audit), fairness, and responsible data policy.</w:t>
       </w:r>
     </w:p>
     <w:p>
@@ -382,7 +382,7 @@
           <w:color w:val="1E293B"/>
           <w:sz w:val="19"/>
         </w:rPr>
-        <w:t>Joining the UNDP DAI Hub is an exceptional o</w:t>
+        <w:t>Joining the UNDP DAI Hub is an exceptional opportunity to transla</w:t>
       </w:r>
       <w:r>
         <w:rPr>
@@ -390,15 +390,7 @@
           <w:color w:val="1E293B"/>
           <w:sz w:val="19"/>
         </w:rPr>
-        <w:t>pportunity to translate cutting-edge AI research into scalable, inclusive development solutions for Country Offices. Available immediately for a 3-month remote arrangement, I am eager to contribute with technical rigor, intercultural agility, and high dedi</w:t>
-      </w:r>
-      <w:r>
-        <w:rPr>
-          <w:rFonts w:ascii="Segoe UI" w:hAnsi="Segoe UI"/>
-          <w:color w:val="1E293B"/>
-          <w:sz w:val="19"/>
-        </w:rPr>
-        <w:t>cation.</w:t>
+        <w:t>te cutting-edge AI research into scalable, inclusive development solutions for Country Offices. Available immediately for a 3-month remote arrangement, I am eager to contribute with technical rigor, intercultural agility, and high dedication.</w:t>
       </w:r>
     </w:p>
     <w:p>
@@ -411,7 +403,15 @@
           <w:color w:val="1E293B"/>
           <w:sz w:val="19"/>
         </w:rPr>
-        <w:t>Thank you very much for your consideration. I look forward to the opportunity to discuss my application with you.</w:t>
+        <w:t>Thank you ver</w:t>
+      </w:r>
+      <w:r>
+        <w:rPr>
+          <w:rFonts w:ascii="Segoe UI" w:hAnsi="Segoe UI"/>
+          <w:color w:val="1E293B"/>
+          <w:sz w:val="19"/>
+        </w:rPr>
+        <w:t>y much for your consideration. I look forward to the opportunity to discuss my application with you.</w:t>
       </w:r>
     </w:p>
     <w:p>
@@ -13071,7 +13071,7 @@
 </file>
 
 <file path=customXml/itemProps1.xml><?xml version="1.0" encoding="utf-8"?>
-<ds:datastoreItem xmlns:ds="http://schemas.openxmlformats.org/officeDocument/2006/customXml" ds:itemID="{F1DB9E8E-C547-4613-9D03-9C248D512B4E}">
+<ds:datastoreItem xmlns:ds="http://schemas.openxmlformats.org/officeDocument/2006/customXml" ds:itemID="{61EF587E-C3EA-496B-8E7C-05E56977C28F}">
   <ds:schemaRefs>
     <ds:schemaRef ds:uri="http://schemas.openxmlformats.org/officeDocument/2006/bibliography"/>
   </ds:schemaRefs>

</xml_diff>